<commit_message>
Redesign login throttle: bounded store, address-wide limit, Retry-After, TRUSTED_PROXIES
Co-Authored-By: Claude Sonnet 5.5 <noreply@anthropic.com>
Claude-Session: https://claude.ai/code/session_01VtiD3sYzdwe2Z45NHChjBt
</commit_message>
<xml_diff>
--- a/docs/Review_3_Report.docx
+++ b/docs/Review_3_Report.docx
@@ -69,7 +69,7 @@
         <w:t>queries.sql</w:t>
       </w:r>
       <w:r>
-        <w:t xml:space="preserve"> without error. These live results were transcribed from the student's console output into the test matrix; the authoring environment did not produce them. The offline suite (140 tests) was run by the authoring environment. </w:t>
+        <w:t xml:space="preserve"> without error. These live results were transcribed from the student's console output into the test matrix; the authoring environment did not produce them. The offline suite (155 tests) was run by the authoring environment; the throttle redesign (§5) was added after the live run and is covered by offline tests only (the live tests do not touch it). </w:t>
       </w:r>
       <w:r>
         <w:rPr>
@@ -851,7 +851,7 @@
                 <w:b w:val="0"/>
                 <w:sz w:val="16"/>
               </w:rPr>
-              <w:t>140 offline + 19 live PASSED</w:t>
+              <w:t>155 offline + 19 live PASSED</w:t>
             </w:r>
           </w:p>
         </w:tc>
@@ -1552,10 +1552,55 @@
         <w:rPr>
           <w:b/>
         </w:rPr>
-        <w:t>Throttle.</w:t>
+        <w:t>Throttle</w:t>
       </w:r>
       <w:r>
-        <w:t xml:space="preserve"> 5 failed sign-ins per (username, client address) within 5 minutes return HTTP 429. This is in-process only (see §11).</w:t>
+        <w:t xml:space="preserve"> (</w:t>
+      </w:r>
+      <w:r>
+        <w:rPr>
+          <w:rFonts w:ascii="Consolas" w:hAnsi="Consolas"/>
+        </w:rPr>
+        <w:t>services/throttle.py</w:t>
+      </w:r>
+      <w:r>
+        <w:t xml:space="preserve">). Two sliding 5-minute limits: 5 failures per (username, client address) and 20 per client address across all usernames. Another address is never affected, so a user cannot be locked out from elsewhere. Memory is capped at 10,000 entries (expired, then oldest dropped); it is thread-safe. HTTP 429 carries </w:t>
+      </w:r>
+      <w:r>
+        <w:rPr>
+          <w:rFonts w:ascii="Consolas" w:hAnsi="Consolas"/>
+        </w:rPr>
+        <w:t>Retry-After</w:t>
+      </w:r>
+      <w:r>
+        <w:t xml:space="preserve"> and the block is logged. Behind a reverse proxy, </w:t>
+      </w:r>
+      <w:r>
+        <w:rPr>
+          <w:rFonts w:ascii="Consolas" w:hAnsi="Consolas"/>
+        </w:rPr>
+        <w:t>TRUSTED_PROXIES=&lt;n&gt;</w:t>
+      </w:r>
+      <w:r>
+        <w:t xml:space="preserve"> applies Werkzeug </w:t>
+      </w:r>
+      <w:r>
+        <w:rPr>
+          <w:rFonts w:ascii="Consolas" w:hAnsi="Consolas"/>
+        </w:rPr>
+        <w:t>ProxyFix</w:t>
+      </w:r>
+      <w:r>
+        <w:t xml:space="preserve"> for exactly n proxies (default 0: </w:t>
+      </w:r>
+      <w:r>
+        <w:rPr>
+          <w:rFonts w:ascii="Consolas" w:hAnsi="Consolas"/>
+        </w:rPr>
+        <w:t>X-Forwarded-For</w:t>
+      </w:r>
+      <w:r>
+        <w:t xml:space="preserve"> is ignored, so it cannot be spoofed).</w:t>
       </w:r>
     </w:p>
     <w:p>
@@ -2664,16 +2709,7 @@
         <w:pStyle w:val="ListBullet"/>
       </w:pPr>
       <w:r>
-        <w:t xml:space="preserve">Login throttle: in-process dictionary, unbounded memory for many distinct usernames, not proxy-aware (uses the socket address), counters reset on restart and are per worker, and locking by username allows a targeted lockout. Recommended follow-up: bounded or Oracle-backed store, </w:t>
-      </w:r>
-      <w:r>
-        <w:rPr>
-          <w:rFonts w:ascii="Consolas" w:hAnsi="Consolas"/>
-        </w:rPr>
-        <w:t>ProxyFix</w:t>
-      </w:r>
-      <w:r>
-        <w:t xml:space="preserve"> with an exact hop count, progressive delays.</w:t>
+        <w:t>Login throttle: state is per process, so it resets on restart and is not shared between several workers (an Oracle-backed store would be the next step); there is no progressive delay; and the address-wide limit can block everyone behind one shared (NAT) address for up to 5 minutes after 20 failures.</w:t>
       </w:r>
     </w:p>
     <w:p>
@@ -2771,7 +2807,16 @@
         <w:t>test_auth</w:t>
       </w:r>
       <w:r>
-        <w:t xml:space="preserve"> (every route requires sign-in, role matrix, throttle, open redirect, hashing) and </w:t>
+        <w:t xml:space="preserve"> (every route requires sign-in, role matrix, open redirect, hashing), </w:t>
+      </w:r>
+      <w:r>
+        <w:rPr>
+          <w:rFonts w:ascii="Consolas" w:hAnsi="Consolas"/>
+        </w:rPr>
+        <w:t>test_throttle</w:t>
+      </w:r>
+      <w:r>
+        <w:t xml:space="preserve"> (fake-clock throttle limits, bounded memory, proxy header handling) and </w:t>
       </w:r>
       <w:r>
         <w:rPr>
@@ -10807,21 +10852,21 @@
                 <w:b w:val="0"/>
                 <w:sz w:val="16"/>
               </w:rPr>
-              <w:t>GET /health (not signed in) when the database answers</w:t>
-            </w:r>
-          </w:p>
-        </w:tc>
-        <w:tc>
-          <w:tcPr>
-            <w:tcW w:type="dxa" w:w="1440"/>
-          </w:tcPr>
-          <w:p>
-            <w:r>
-              <w:rPr>
-                <w:b w:val="0"/>
-                <w:sz w:val="16"/>
-              </w:rPr>
-              <w:t>HTTP 200, body is exactly {app, database}; no user/service/connection details</w:t>
+              <w:t>manage.py reset-password</w:t>
+            </w:r>
+          </w:p>
+        </w:tc>
+        <w:tc>
+          <w:tcPr>
+            <w:tcW w:type="dxa" w:w="1440"/>
+          </w:tcPr>
+          <w:p>
+            <w:r>
+              <w:rPr>
+                <w:b w:val="0"/>
+                <w:sz w:val="16"/>
+              </w:rPr>
+              <w:t>unknown user -&gt; exit 1; known user -&gt; one UPDATE with a hash, never the password</w:t>
             </w:r>
           </w:p>
         </w:tc>
@@ -10905,21 +10950,21 @@
                 <w:b w:val="0"/>
                 <w:sz w:val="16"/>
               </w:rPr>
-              <w:t>GET /health when the database is down</w:t>
-            </w:r>
-          </w:p>
-        </w:tc>
-        <w:tc>
-          <w:tcPr>
-            <w:tcW w:type="dxa" w:w="1440"/>
-          </w:tcPr>
-          <w:p>
-            <w:r>
-              <w:rPr>
-                <w:b w:val="0"/>
-                <w:sz w:val="16"/>
-              </w:rPr>
-              <w:t>HTTP 503 with {app, database: unavailable} only; the reason is written to the server log</w:t>
+              <w:t>GET /health (not signed in) when the database answers</w:t>
+            </w:r>
+          </w:p>
+        </w:tc>
+        <w:tc>
+          <w:tcPr>
+            <w:tcW w:type="dxa" w:w="1440"/>
+          </w:tcPr>
+          <w:p>
+            <w:r>
+              <w:rPr>
+                <w:b w:val="0"/>
+                <w:sz w:val="16"/>
+              </w:rPr>
+              <w:t>HTTP 200, body is exactly {app, database}; no user/service/connection details</w:t>
             </w:r>
           </w:p>
         </w:tc>
@@ -11003,21 +11048,21 @@
                 <w:b w:val="0"/>
                 <w:sz w:val="16"/>
               </w:rPr>
-              <w:t>GET /health with no DB_* settings (real health_check, nothing stubbed)</w:t>
-            </w:r>
-          </w:p>
-        </w:tc>
-        <w:tc>
-          <w:tcPr>
-            <w:tcW w:type="dxa" w:w="1440"/>
-          </w:tcPr>
-          <w:p>
-            <w:r>
-              <w:rPr>
-                <w:b w:val="0"/>
-                <w:sz w:val="16"/>
-              </w:rPr>
-              <w:t>503 and the body does not name the missing variables</w:t>
+              <w:t>GET /health when the database is down</w:t>
+            </w:r>
+          </w:p>
+        </w:tc>
+        <w:tc>
+          <w:tcPr>
+            <w:tcW w:type="dxa" w:w="1440"/>
+          </w:tcPr>
+          <w:p>
+            <w:r>
+              <w:rPr>
+                <w:b w:val="0"/>
+                <w:sz w:val="16"/>
+              </w:rPr>
+              <w:t>HTTP 503 with {app, database: unavailable} only; the reason is written to the server log</w:t>
             </w:r>
           </w:p>
         </w:tc>
@@ -11101,21 +11146,21 @@
                 <w:b w:val="0"/>
                 <w:sz w:val="16"/>
               </w:rPr>
-              <w:t>GET /health anonymous vs signed-in manager</w:t>
-            </w:r>
-          </w:p>
-        </w:tc>
-        <w:tc>
-          <w:tcPr>
-            <w:tcW w:type="dxa" w:w="1440"/>
-          </w:tcPr>
-          <w:p>
-            <w:r>
-              <w:rPr>
-                <w:b w:val="0"/>
-                <w:sz w:val="16"/>
-              </w:rPr>
-              <w:t>no login redirect, and signed-in users do not get extra database details either</w:t>
+              <w:t>GET /health with no DB_* settings (real health_check, nothing stubbed)</w:t>
+            </w:r>
+          </w:p>
+        </w:tc>
+        <w:tc>
+          <w:tcPr>
+            <w:tcW w:type="dxa" w:w="1440"/>
+          </w:tcPr>
+          <w:p>
+            <w:r>
+              <w:rPr>
+                <w:b w:val="0"/>
+                <w:sz w:val="16"/>
+              </w:rPr>
+              <w:t>503 and the body does not name the missing variables</w:t>
             </w:r>
           </w:p>
         </w:tc>
@@ -11199,21 +11244,21 @@
                 <w:b w:val="0"/>
                 <w:sz w:val="16"/>
               </w:rPr>
-              <w:t>authenticate when Oracle returns Decimal ids</w:t>
-            </w:r>
-          </w:p>
-        </w:tc>
-        <w:tc>
-          <w:tcPr>
-            <w:tcW w:type="dxa" w:w="1440"/>
-          </w:tcPr>
-          <w:p>
-            <w:r>
-              <w:rPr>
-                <w:b w:val="0"/>
-                <w:sz w:val="16"/>
-              </w:rPr>
-              <w:t>session user has int id/employee_id (survives the cookie round trip)</w:t>
+              <w:t>GET /health anonymous vs signed-in manager</w:t>
+            </w:r>
+          </w:p>
+        </w:tc>
+        <w:tc>
+          <w:tcPr>
+            <w:tcW w:type="dxa" w:w="1440"/>
+          </w:tcPr>
+          <w:p>
+            <w:r>
+              <w:rPr>
+                <w:b w:val="0"/>
+                <w:sz w:val="16"/>
+              </w:rPr>
+              <w:t>no login redirect, and signed-in users do not get extra database details either</w:t>
             </w:r>
           </w:p>
         </w:tc>
@@ -11297,21 +11342,21 @@
                 <w:b w:val="0"/>
                 <w:sz w:val="16"/>
               </w:rPr>
-              <w:t>users.delete with the acting id as text ('3', as read back from the session cookie)</w:t>
-            </w:r>
-          </w:p>
-        </w:tc>
-        <w:tc>
-          <w:tcPr>
-            <w:tcW w:type="dxa" w:w="1440"/>
-          </w:tcPr>
-          <w:p>
-            <w:r>
-              <w:rPr>
-                <w:b w:val="0"/>
-                <w:sz w:val="16"/>
-              </w:rPr>
-              <w:t>ConflictError, no DELETE issued</w:t>
+              <w:t>authenticate when Oracle returns Decimal ids</w:t>
+            </w:r>
+          </w:p>
+        </w:tc>
+        <w:tc>
+          <w:tcPr>
+            <w:tcW w:type="dxa" w:w="1440"/>
+          </w:tcPr>
+          <w:p>
+            <w:r>
+              <w:rPr>
+                <w:b w:val="0"/>
+                <w:sz w:val="16"/>
+              </w:rPr>
+              <w:t>session user has int id/employee_id (survives the cookie round trip)</w:t>
             </w:r>
           </w:p>
         </w:tc>
@@ -11395,21 +11440,21 @@
                 <w:b w:val="0"/>
                 <w:sz w:val="16"/>
               </w:rPr>
-              <w:t>Sign in through the real authenticate() with Decimal ids, then open /users</w:t>
-            </w:r>
-          </w:p>
-        </w:tc>
-        <w:tc>
-          <w:tcPr>
-            <w:tcW w:type="dxa" w:w="1440"/>
-          </w:tcPr>
-          <w:p>
-            <w:r>
-              <w:rPr>
-                <w:b w:val="0"/>
-                <w:sz w:val="16"/>
-              </w:rPr>
-              <w:t>own row shows 'you', the other manager shows 'protected'; no Delete button on either</w:t>
+              <w:t>users.delete with the acting id as text ('3', as read back from the session cookie)</w:t>
+            </w:r>
+          </w:p>
+        </w:tc>
+        <w:tc>
+          <w:tcPr>
+            <w:tcW w:type="dxa" w:w="1440"/>
+          </w:tcPr>
+          <w:p>
+            <w:r>
+              <w:rPr>
+                <w:b w:val="0"/>
+                <w:sz w:val="16"/>
+              </w:rPr>
+              <w:t>ConflictError, no DELETE issued</w:t>
             </w:r>
           </w:p>
         </w:tc>
@@ -11493,21 +11538,21 @@
                 <w:b w:val="0"/>
                 <w:sz w:val="16"/>
               </w:rPr>
-              <w:t>Two managers and one cashier listed</w:t>
-            </w:r>
-          </w:p>
-        </w:tc>
-        <w:tc>
-          <w:tcPr>
-            <w:tcW w:type="dxa" w:w="1440"/>
-          </w:tcPr>
-          <w:p>
-            <w:r>
-              <w:rPr>
-                <w:b w:val="0"/>
-                <w:sz w:val="16"/>
-              </w:rPr>
-              <w:t>exactly one Delete button, and it belongs to the cashier</w:t>
+              <w:t>Sign in through the real authenticate() with Decimal ids, then open /users</w:t>
+            </w:r>
+          </w:p>
+        </w:tc>
+        <w:tc>
+          <w:tcPr>
+            <w:tcW w:type="dxa" w:w="1440"/>
+          </w:tcPr>
+          <w:p>
+            <w:r>
+              <w:rPr>
+                <w:b w:val="0"/>
+                <w:sz w:val="16"/>
+              </w:rPr>
+              <w:t>own row shows 'you', the other manager shows 'protected'; no Delete button on either</w:t>
             </w:r>
           </w:p>
         </w:tc>
@@ -11591,6 +11636,104 @@
                 <w:b w:val="0"/>
                 <w:sz w:val="16"/>
               </w:rPr>
+              <w:t>Two managers and one cashier listed</w:t>
+            </w:r>
+          </w:p>
+        </w:tc>
+        <w:tc>
+          <w:tcPr>
+            <w:tcW w:type="dxa" w:w="1440"/>
+          </w:tcPr>
+          <w:p>
+            <w:r>
+              <w:rPr>
+                <w:b w:val="0"/>
+                <w:sz w:val="16"/>
+              </w:rPr>
+              <w:t>exactly one Delete button, and it belongs to the cashier</w:t>
+            </w:r>
+          </w:p>
+        </w:tc>
+        <w:tc>
+          <w:tcPr>
+            <w:tcW w:type="dxa" w:w="1440"/>
+          </w:tcPr>
+          <w:p>
+            <w:r>
+              <w:rPr>
+                <w:b w:val="0"/>
+                <w:sz w:val="16"/>
+              </w:rPr>
+              <w:t>Executed; assertions held</w:t>
+            </w:r>
+          </w:p>
+        </w:tc>
+        <w:tc>
+          <w:tcPr>
+            <w:tcW w:type="dxa" w:w="1440"/>
+          </w:tcPr>
+          <w:p>
+            <w:r>
+              <w:rPr>
+                <w:b w:val="0"/>
+                <w:sz w:val="16"/>
+              </w:rPr>
+            </w:r>
+            <w:r>
+              <w:rPr>
+                <w:b/>
+                <w:sz w:val="16"/>
+              </w:rPr>
+              <w:t>PASSED</w:t>
+            </w:r>
+            <w:r>
+              <w:rPr>
+                <w:b w:val="0"/>
+                <w:sz w:val="16"/>
+              </w:rPr>
+            </w:r>
+          </w:p>
+        </w:tc>
+        <w:tc>
+          <w:tcPr>
+            <w:tcW w:type="dxa" w:w="1440"/>
+          </w:tcPr>
+          <w:p>
+            <w:r>
+              <w:rPr>
+                <w:b w:val="0"/>
+                <w:sz w:val="16"/>
+              </w:rPr>
+              <w:t>Flask test client, fake database</w:t>
+            </w:r>
+          </w:p>
+        </w:tc>
+      </w:tr>
+      <w:tr>
+        <w:tc>
+          <w:tcPr>
+            <w:tcW w:type="dxa" w:w="1440"/>
+          </w:tcPr>
+          <w:p>
+            <w:r>
+              <w:rPr>
+                <w:b w:val="0"/>
+                <w:sz w:val="16"/>
+              </w:rPr>
+              <w:t>AUT-37</w:t>
+            </w:r>
+          </w:p>
+        </w:tc>
+        <w:tc>
+          <w:tcPr>
+            <w:tcW w:type="dxa" w:w="1440"/>
+          </w:tcPr>
+          <w:p>
+            <w:r>
+              <w:rPr>
+                <w:b w:val="0"/>
+                <w:sz w:val="16"/>
+              </w:rPr>
               <w:t>POST /users/&lt;manager id&gt;/delete as a manager</w:t>
             </w:r>
           </w:p>
@@ -11660,6 +11803,790 @@
                 <w:sz w:val="16"/>
               </w:rPr>
               <w:t>Flask test client, fake database</w:t>
+            </w:r>
+          </w:p>
+        </w:tc>
+      </w:tr>
+      <w:tr>
+        <w:tc>
+          <w:tcPr>
+            <w:tcW w:type="dxa" w:w="1440"/>
+          </w:tcPr>
+          <w:p>
+            <w:r>
+              <w:rPr>
+                <w:b w:val="0"/>
+                <w:sz w:val="16"/>
+              </w:rPr>
+              <w:t>THR-01</w:t>
+            </w:r>
+          </w:p>
+        </w:tc>
+        <w:tc>
+          <w:tcPr>
+            <w:tcW w:type="dxa" w:w="1440"/>
+          </w:tcPr>
+          <w:p>
+            <w:r>
+              <w:rPr>
+                <w:b w:val="0"/>
+                <w:sz w:val="16"/>
+              </w:rPr>
+              <w:t>5 failures for one user+address</w:t>
+            </w:r>
+          </w:p>
+        </w:tc>
+        <w:tc>
+          <w:tcPr>
+            <w:tcW w:type="dxa" w:w="1440"/>
+          </w:tcPr>
+          <w:p>
+            <w:r>
+              <w:rPr>
+                <w:b w:val="0"/>
+                <w:sz w:val="16"/>
+              </w:rPr>
+              <w:t>blocked with the seconds until the oldest failure expires</w:t>
+            </w:r>
+          </w:p>
+        </w:tc>
+        <w:tc>
+          <w:tcPr>
+            <w:tcW w:type="dxa" w:w="1440"/>
+          </w:tcPr>
+          <w:p>
+            <w:r>
+              <w:rPr>
+                <w:b w:val="0"/>
+                <w:sz w:val="16"/>
+              </w:rPr>
+              <w:t>Executed; assertions held</w:t>
+            </w:r>
+          </w:p>
+        </w:tc>
+        <w:tc>
+          <w:tcPr>
+            <w:tcW w:type="dxa" w:w="1440"/>
+          </w:tcPr>
+          <w:p>
+            <w:r>
+              <w:rPr>
+                <w:b w:val="0"/>
+                <w:sz w:val="16"/>
+              </w:rPr>
+            </w:r>
+            <w:r>
+              <w:rPr>
+                <w:b/>
+                <w:sz w:val="16"/>
+              </w:rPr>
+              <w:t>PASSED</w:t>
+            </w:r>
+            <w:r>
+              <w:rPr>
+                <w:b w:val="0"/>
+                <w:sz w:val="16"/>
+              </w:rPr>
+            </w:r>
+          </w:p>
+        </w:tc>
+        <w:tc>
+          <w:tcPr>
+            <w:tcW w:type="dxa" w:w="1440"/>
+          </w:tcPr>
+          <w:p>
+            <w:r>
+              <w:rPr>
+                <w:b w:val="0"/>
+                <w:sz w:val="16"/>
+              </w:rPr>
+              <w:t>Fake clock; Flask test client</w:t>
+            </w:r>
+          </w:p>
+        </w:tc>
+      </w:tr>
+      <w:tr>
+        <w:tc>
+          <w:tcPr>
+            <w:tcW w:type="dxa" w:w="1440"/>
+          </w:tcPr>
+          <w:p>
+            <w:r>
+              <w:rPr>
+                <w:b w:val="0"/>
+                <w:sz w:val="16"/>
+              </w:rPr>
+              <w:t>THR-02</w:t>
+            </w:r>
+          </w:p>
+        </w:tc>
+        <w:tc>
+          <w:tcPr>
+            <w:tcW w:type="dxa" w:w="1440"/>
+          </w:tcPr>
+          <w:p>
+            <w:r>
+              <w:rPr>
+                <w:b w:val="0"/>
+                <w:sz w:val="16"/>
+              </w:rPr>
+              <w:t>Lockout is per user+address</w:t>
+            </w:r>
+          </w:p>
+        </w:tc>
+        <w:tc>
+          <w:tcPr>
+            <w:tcW w:type="dxa" w:w="1440"/>
+          </w:tcPr>
+          <w:p>
+            <w:r>
+              <w:rPr>
+                <w:b w:val="0"/>
+                <w:sz w:val="16"/>
+              </w:rPr>
+              <w:t>the same user from another address, and another user at the same address, still sign in</w:t>
+            </w:r>
+          </w:p>
+        </w:tc>
+        <w:tc>
+          <w:tcPr>
+            <w:tcW w:type="dxa" w:w="1440"/>
+          </w:tcPr>
+          <w:p>
+            <w:r>
+              <w:rPr>
+                <w:b w:val="0"/>
+                <w:sz w:val="16"/>
+              </w:rPr>
+              <w:t>Executed; assertions held</w:t>
+            </w:r>
+          </w:p>
+        </w:tc>
+        <w:tc>
+          <w:tcPr>
+            <w:tcW w:type="dxa" w:w="1440"/>
+          </w:tcPr>
+          <w:p>
+            <w:r>
+              <w:rPr>
+                <w:b w:val="0"/>
+                <w:sz w:val="16"/>
+              </w:rPr>
+            </w:r>
+            <w:r>
+              <w:rPr>
+                <w:b/>
+                <w:sz w:val="16"/>
+              </w:rPr>
+              <w:t>PASSED</w:t>
+            </w:r>
+            <w:r>
+              <w:rPr>
+                <w:b w:val="0"/>
+                <w:sz w:val="16"/>
+              </w:rPr>
+            </w:r>
+          </w:p>
+        </w:tc>
+        <w:tc>
+          <w:tcPr>
+            <w:tcW w:type="dxa" w:w="1440"/>
+          </w:tcPr>
+          <w:p>
+            <w:r>
+              <w:rPr>
+                <w:b w:val="0"/>
+                <w:sz w:val="16"/>
+              </w:rPr>
+              <w:t>Fake clock; Flask test client</w:t>
+            </w:r>
+          </w:p>
+        </w:tc>
+      </w:tr>
+      <w:tr>
+        <w:tc>
+          <w:tcPr>
+            <w:tcW w:type="dxa" w:w="1440"/>
+          </w:tcPr>
+          <w:p>
+            <w:r>
+              <w:rPr>
+                <w:b w:val="0"/>
+                <w:sz w:val="16"/>
+              </w:rPr>
+              <w:t>THR-03</w:t>
+            </w:r>
+          </w:p>
+        </w:tc>
+        <w:tc>
+          <w:tcPr>
+            <w:tcW w:type="dxa" w:w="1440"/>
+          </w:tcPr>
+          <w:p>
+            <w:r>
+              <w:rPr>
+                <w:b w:val="0"/>
+                <w:sz w:val="16"/>
+              </w:rPr>
+              <w:t>20 failures from one address across different usernames</w:t>
+            </w:r>
+          </w:p>
+        </w:tc>
+        <w:tc>
+          <w:tcPr>
+            <w:tcW w:type="dxa" w:w="1440"/>
+          </w:tcPr>
+          <w:p>
+            <w:r>
+              <w:rPr>
+                <w:b w:val="0"/>
+                <w:sz w:val="16"/>
+              </w:rPr>
+              <w:t>the address is blocked for every username</w:t>
+            </w:r>
+          </w:p>
+        </w:tc>
+        <w:tc>
+          <w:tcPr>
+            <w:tcW w:type="dxa" w:w="1440"/>
+          </w:tcPr>
+          <w:p>
+            <w:r>
+              <w:rPr>
+                <w:b w:val="0"/>
+                <w:sz w:val="16"/>
+              </w:rPr>
+              <w:t>Executed; assertions held</w:t>
+            </w:r>
+          </w:p>
+        </w:tc>
+        <w:tc>
+          <w:tcPr>
+            <w:tcW w:type="dxa" w:w="1440"/>
+          </w:tcPr>
+          <w:p>
+            <w:r>
+              <w:rPr>
+                <w:b w:val="0"/>
+                <w:sz w:val="16"/>
+              </w:rPr>
+            </w:r>
+            <w:r>
+              <w:rPr>
+                <w:b/>
+                <w:sz w:val="16"/>
+              </w:rPr>
+              <w:t>PASSED</w:t>
+            </w:r>
+            <w:r>
+              <w:rPr>
+                <w:b w:val="0"/>
+                <w:sz w:val="16"/>
+              </w:rPr>
+            </w:r>
+          </w:p>
+        </w:tc>
+        <w:tc>
+          <w:tcPr>
+            <w:tcW w:type="dxa" w:w="1440"/>
+          </w:tcPr>
+          <w:p>
+            <w:r>
+              <w:rPr>
+                <w:b w:val="0"/>
+                <w:sz w:val="16"/>
+              </w:rPr>
+              <w:t>Fake clock; Flask test client</w:t>
+            </w:r>
+          </w:p>
+        </w:tc>
+      </w:tr>
+      <w:tr>
+        <w:tc>
+          <w:tcPr>
+            <w:tcW w:type="dxa" w:w="1440"/>
+          </w:tcPr>
+          <w:p>
+            <w:r>
+              <w:rPr>
+                <w:b w:val="0"/>
+                <w:sz w:val="16"/>
+              </w:rPr>
+              <w:t>THR-04</w:t>
+            </w:r>
+          </w:p>
+        </w:tc>
+        <w:tc>
+          <w:tcPr>
+            <w:tcW w:type="dxa" w:w="1440"/>
+          </w:tcPr>
+          <w:p>
+            <w:r>
+              <w:rPr>
+                <w:b w:val="0"/>
+                <w:sz w:val="16"/>
+              </w:rPr>
+              <w:t>After the window passes, or after a successful sign-in</w:t>
+            </w:r>
+          </w:p>
+        </w:tc>
+        <w:tc>
+          <w:tcPr>
+            <w:tcW w:type="dxa" w:w="1440"/>
+          </w:tcPr>
+          <w:p>
+            <w:r>
+              <w:rPr>
+                <w:b w:val="0"/>
+                <w:sz w:val="16"/>
+              </w:rPr>
+              <w:t>the user may try again</w:t>
+            </w:r>
+          </w:p>
+        </w:tc>
+        <w:tc>
+          <w:tcPr>
+            <w:tcW w:type="dxa" w:w="1440"/>
+          </w:tcPr>
+          <w:p>
+            <w:r>
+              <w:rPr>
+                <w:b w:val="0"/>
+                <w:sz w:val="16"/>
+              </w:rPr>
+              <w:t>Executed; assertions held</w:t>
+            </w:r>
+          </w:p>
+        </w:tc>
+        <w:tc>
+          <w:tcPr>
+            <w:tcW w:type="dxa" w:w="1440"/>
+          </w:tcPr>
+          <w:p>
+            <w:r>
+              <w:rPr>
+                <w:b w:val="0"/>
+                <w:sz w:val="16"/>
+              </w:rPr>
+            </w:r>
+            <w:r>
+              <w:rPr>
+                <w:b/>
+                <w:sz w:val="16"/>
+              </w:rPr>
+              <w:t>PASSED</w:t>
+            </w:r>
+            <w:r>
+              <w:rPr>
+                <w:b w:val="0"/>
+                <w:sz w:val="16"/>
+              </w:rPr>
+            </w:r>
+          </w:p>
+        </w:tc>
+        <w:tc>
+          <w:tcPr>
+            <w:tcW w:type="dxa" w:w="1440"/>
+          </w:tcPr>
+          <w:p>
+            <w:r>
+              <w:rPr>
+                <w:b w:val="0"/>
+                <w:sz w:val="16"/>
+              </w:rPr>
+              <w:t>Fake clock; Flask test client</w:t>
+            </w:r>
+          </w:p>
+        </w:tc>
+      </w:tr>
+      <w:tr>
+        <w:tc>
+          <w:tcPr>
+            <w:tcW w:type="dxa" w:w="1440"/>
+          </w:tcPr>
+          <w:p>
+            <w:r>
+              <w:rPr>
+                <w:b w:val="0"/>
+                <w:sz w:val="16"/>
+              </w:rPr>
+              <w:t>THR-05</w:t>
+            </w:r>
+          </w:p>
+        </w:tc>
+        <w:tc>
+          <w:tcPr>
+            <w:tcW w:type="dxa" w:w="1440"/>
+          </w:tcPr>
+          <w:p>
+            <w:r>
+              <w:rPr>
+                <w:b w:val="0"/>
+                <w:sz w:val="16"/>
+              </w:rPr>
+              <w:t>Flood of random usernames</w:t>
+            </w:r>
+          </w:p>
+        </w:tc>
+        <w:tc>
+          <w:tcPr>
+            <w:tcW w:type="dxa" w:w="1440"/>
+          </w:tcPr>
+          <w:p>
+            <w:r>
+              <w:rPr>
+                <w:b w:val="0"/>
+                <w:sz w:val="16"/>
+              </w:rPr>
+              <w:t>at most max_entries kept; entries older than the window are pruned</w:t>
+            </w:r>
+          </w:p>
+        </w:tc>
+        <w:tc>
+          <w:tcPr>
+            <w:tcW w:type="dxa" w:w="1440"/>
+          </w:tcPr>
+          <w:p>
+            <w:r>
+              <w:rPr>
+                <w:b w:val="0"/>
+                <w:sz w:val="16"/>
+              </w:rPr>
+              <w:t>Executed; assertions held</w:t>
+            </w:r>
+          </w:p>
+        </w:tc>
+        <w:tc>
+          <w:tcPr>
+            <w:tcW w:type="dxa" w:w="1440"/>
+          </w:tcPr>
+          <w:p>
+            <w:r>
+              <w:rPr>
+                <w:b w:val="0"/>
+                <w:sz w:val="16"/>
+              </w:rPr>
+            </w:r>
+            <w:r>
+              <w:rPr>
+                <w:b/>
+                <w:sz w:val="16"/>
+              </w:rPr>
+              <w:t>PASSED</w:t>
+            </w:r>
+            <w:r>
+              <w:rPr>
+                <w:b w:val="0"/>
+                <w:sz w:val="16"/>
+              </w:rPr>
+            </w:r>
+          </w:p>
+        </w:tc>
+        <w:tc>
+          <w:tcPr>
+            <w:tcW w:type="dxa" w:w="1440"/>
+          </w:tcPr>
+          <w:p>
+            <w:r>
+              <w:rPr>
+                <w:b w:val="0"/>
+                <w:sz w:val="16"/>
+              </w:rPr>
+              <w:t>Fake clock; Flask test client</w:t>
+            </w:r>
+          </w:p>
+        </w:tc>
+      </w:tr>
+      <w:tr>
+        <w:tc>
+          <w:tcPr>
+            <w:tcW w:type="dxa" w:w="1440"/>
+          </w:tcPr>
+          <w:p>
+            <w:r>
+              <w:rPr>
+                <w:b w:val="0"/>
+                <w:sz w:val="16"/>
+              </w:rPr>
+              <w:t>THR-06</w:t>
+            </w:r>
+          </w:p>
+        </w:tc>
+        <w:tc>
+          <w:tcPr>
+            <w:tcW w:type="dxa" w:w="1440"/>
+          </w:tcPr>
+          <w:p>
+            <w:r>
+              <w:rPr>
+                <w:b w:val="0"/>
+                <w:sz w:val="16"/>
+              </w:rPr>
+              <w:t>6th failed sign-in</w:t>
+            </w:r>
+          </w:p>
+        </w:tc>
+        <w:tc>
+          <w:tcPr>
+            <w:tcW w:type="dxa" w:w="1440"/>
+          </w:tcPr>
+          <w:p>
+            <w:r>
+              <w:rPr>
+                <w:b w:val="0"/>
+                <w:sz w:val="16"/>
+              </w:rPr>
+              <w:t>HTTP 429 with a Retry-After header and the friendly message</w:t>
+            </w:r>
+          </w:p>
+        </w:tc>
+        <w:tc>
+          <w:tcPr>
+            <w:tcW w:type="dxa" w:w="1440"/>
+          </w:tcPr>
+          <w:p>
+            <w:r>
+              <w:rPr>
+                <w:b w:val="0"/>
+                <w:sz w:val="16"/>
+              </w:rPr>
+              <w:t>Executed; assertions held</w:t>
+            </w:r>
+          </w:p>
+        </w:tc>
+        <w:tc>
+          <w:tcPr>
+            <w:tcW w:type="dxa" w:w="1440"/>
+          </w:tcPr>
+          <w:p>
+            <w:r>
+              <w:rPr>
+                <w:b w:val="0"/>
+                <w:sz w:val="16"/>
+              </w:rPr>
+            </w:r>
+            <w:r>
+              <w:rPr>
+                <w:b/>
+                <w:sz w:val="16"/>
+              </w:rPr>
+              <w:t>PASSED</w:t>
+            </w:r>
+            <w:r>
+              <w:rPr>
+                <w:b w:val="0"/>
+                <w:sz w:val="16"/>
+              </w:rPr>
+            </w:r>
+          </w:p>
+        </w:tc>
+        <w:tc>
+          <w:tcPr>
+            <w:tcW w:type="dxa" w:w="1440"/>
+          </w:tcPr>
+          <w:p>
+            <w:r>
+              <w:rPr>
+                <w:b w:val="0"/>
+                <w:sz w:val="16"/>
+              </w:rPr>
+              <w:t>Fake clock; Flask test client</w:t>
+            </w:r>
+          </w:p>
+        </w:tc>
+      </w:tr>
+      <w:tr>
+        <w:tc>
+          <w:tcPr>
+            <w:tcW w:type="dxa" w:w="1440"/>
+          </w:tcPr>
+          <w:p>
+            <w:r>
+              <w:rPr>
+                <w:b w:val="0"/>
+                <w:sz w:val="16"/>
+              </w:rPr>
+              <w:t>THR-07</w:t>
+            </w:r>
+          </w:p>
+        </w:tc>
+        <w:tc>
+          <w:tcPr>
+            <w:tcW w:type="dxa" w:w="1440"/>
+          </w:tcPr>
+          <w:p>
+            <w:r>
+              <w:rPr>
+                <w:b w:val="0"/>
+                <w:sz w:val="16"/>
+              </w:rPr>
+              <w:t>X-Forwarded-For with TRUSTED_PROXIES=0</w:t>
+            </w:r>
+          </w:p>
+        </w:tc>
+        <w:tc>
+          <w:tcPr>
+            <w:tcW w:type="dxa" w:w="1440"/>
+          </w:tcPr>
+          <w:p>
+            <w:r>
+              <w:rPr>
+                <w:b w:val="0"/>
+                <w:sz w:val="16"/>
+              </w:rPr>
+              <w:t>spoofed addresses do not dodge the limit; with 1 hop the real client address is used</w:t>
+            </w:r>
+          </w:p>
+        </w:tc>
+        <w:tc>
+          <w:tcPr>
+            <w:tcW w:type="dxa" w:w="1440"/>
+          </w:tcPr>
+          <w:p>
+            <w:r>
+              <w:rPr>
+                <w:b w:val="0"/>
+                <w:sz w:val="16"/>
+              </w:rPr>
+              <w:t>Executed; assertions held</w:t>
+            </w:r>
+          </w:p>
+        </w:tc>
+        <w:tc>
+          <w:tcPr>
+            <w:tcW w:type="dxa" w:w="1440"/>
+          </w:tcPr>
+          <w:p>
+            <w:r>
+              <w:rPr>
+                <w:b w:val="0"/>
+                <w:sz w:val="16"/>
+              </w:rPr>
+            </w:r>
+            <w:r>
+              <w:rPr>
+                <w:b/>
+                <w:sz w:val="16"/>
+              </w:rPr>
+              <w:t>PASSED</w:t>
+            </w:r>
+            <w:r>
+              <w:rPr>
+                <w:b w:val="0"/>
+                <w:sz w:val="16"/>
+              </w:rPr>
+            </w:r>
+          </w:p>
+        </w:tc>
+        <w:tc>
+          <w:tcPr>
+            <w:tcW w:type="dxa" w:w="1440"/>
+          </w:tcPr>
+          <w:p>
+            <w:r>
+              <w:rPr>
+                <w:b w:val="0"/>
+                <w:sz w:val="16"/>
+              </w:rPr>
+              <w:t>Fake clock; Flask test client</w:t>
+            </w:r>
+          </w:p>
+        </w:tc>
+      </w:tr>
+      <w:tr>
+        <w:tc>
+          <w:tcPr>
+            <w:tcW w:type="dxa" w:w="1440"/>
+          </w:tcPr>
+          <w:p>
+            <w:r>
+              <w:rPr>
+                <w:b w:val="0"/>
+                <w:sz w:val="16"/>
+              </w:rPr>
+              <w:t>THR-08</w:t>
+            </w:r>
+          </w:p>
+        </w:tc>
+        <w:tc>
+          <w:tcPr>
+            <w:tcW w:type="dxa" w:w="1440"/>
+          </w:tcPr>
+          <w:p>
+            <w:r>
+              <w:rPr>
+                <w:b w:val="0"/>
+                <w:sz w:val="16"/>
+              </w:rPr>
+              <w:t>TRUSTED_PROXIES env value (7 parameter sets)</w:t>
+            </w:r>
+          </w:p>
+        </w:tc>
+        <w:tc>
+          <w:tcPr>
+            <w:tcW w:type="dxa" w:w="1440"/>
+          </w:tcPr>
+          <w:p>
+            <w:r>
+              <w:rPr>
+                <w:b w:val="0"/>
+                <w:sz w:val="16"/>
+              </w:rPr>
+              <w:t>0-5 accepted (default 0); anything else raises ConfigError</w:t>
+            </w:r>
+          </w:p>
+        </w:tc>
+        <w:tc>
+          <w:tcPr>
+            <w:tcW w:type="dxa" w:w="1440"/>
+          </w:tcPr>
+          <w:p>
+            <w:r>
+              <w:rPr>
+                <w:b w:val="0"/>
+                <w:sz w:val="16"/>
+              </w:rPr>
+              <w:t>Executed; assertions held</w:t>
+            </w:r>
+          </w:p>
+        </w:tc>
+        <w:tc>
+          <w:tcPr>
+            <w:tcW w:type="dxa" w:w="1440"/>
+          </w:tcPr>
+          <w:p>
+            <w:r>
+              <w:rPr>
+                <w:b w:val="0"/>
+                <w:sz w:val="16"/>
+              </w:rPr>
+            </w:r>
+            <w:r>
+              <w:rPr>
+                <w:b/>
+                <w:sz w:val="16"/>
+              </w:rPr>
+              <w:t>PASSED</w:t>
+            </w:r>
+            <w:r>
+              <w:rPr>
+                <w:b w:val="0"/>
+                <w:sz w:val="16"/>
+              </w:rPr>
+            </w:r>
+          </w:p>
+        </w:tc>
+        <w:tc>
+          <w:tcPr>
+            <w:tcW w:type="dxa" w:w="1440"/>
+          </w:tcPr>
+          <w:p>
+            <w:r>
+              <w:rPr>
+                <w:b w:val="0"/>
+                <w:sz w:val="16"/>
+              </w:rPr>
+              <w:t>Fake clock; Flask test client</w:t>
             </w:r>
           </w:p>
         </w:tc>
@@ -13530,7 +14457,7 @@
     <w:p/>
     <w:p>
       <w:r>
-        <w:t>Totals by pytest case: PASSED 159</w:t>
+        <w:t>Totals by pytest case: PASSED 174</w:t>
       </w:r>
     </w:p>
     <w:p>
@@ -13573,7 +14500,7 @@
     </w:p>
     <w:p>
       <w:r>
-        <w:t>Review 3 turns the database project into a complete, role-protected web application: a default-deny sign-in gate, Manager and Cashier roles, employee and account management, hardened error and health handling, a production-style launcher and a deployment guide. 140 offline tests and 19 live Oracle tests passed, and all 16 queries ran live. The main open items are the deferred throttle redesign, HTTPS deployment and a recorded end-to-end browser walkthrough.</w:t>
+        <w:t>Review 3 turns the database project into a complete, role-protected web application: a default-deny sign-in gate, Manager and Cashier roles, employee and account management, hardened error and health handling, a production-style launcher and a deployment guide. 155 offline tests and 19 live Oracle tests passed, and all 16 queries ran live. The login throttle is bounded and proxy-aware. The main open items are HTTPS deployment and a recorded end-to-end browser walkthrough.</w:t>
       </w:r>
     </w:p>
     <w:sectPr>

</xml_diff>